<commit_message>
Updated Master Databases Folder
</commit_message>
<xml_diff>
--- a/0. Master Databases/References.docx
+++ b/0. Master Databases/References.docx
@@ -1,6 +1,6 @@
 
 <file path=word/document.xml><?xml version="1.0" encoding="utf-8"?>
-<w:document xmlns:wpc="http://schemas.microsoft.com/office/word/2010/wordprocessingCanvas" xmlns:cx="http://schemas.microsoft.com/office/drawing/2014/chartex" xmlns:cx1="http://schemas.microsoft.com/office/drawing/2015/9/8/chartex" xmlns:cx2="http://schemas.microsoft.com/office/drawing/2015/10/21/chartex" xmlns:cx3="http://schemas.microsoft.com/office/drawing/2016/5/9/chartex" xmlns:cx4="http://schemas.microsoft.com/office/drawing/2016/5/10/chartex" xmlns:cx5="http://schemas.microsoft.com/office/drawing/2016/5/11/chartex" xmlns:cx6="http://schemas.microsoft.com/office/drawing/2016/5/12/chartex" xmlns:cx7="http://schemas.microsoft.com/office/drawing/2016/5/13/chartex" xmlns:cx8="http://schemas.microsoft.com/office/drawing/2016/5/14/chartex" xmlns:mc="http://schemas.openxmlformats.org/markup-compatibility/2006" xmlns:aink="http://schemas.microsoft.com/office/drawing/2016/ink" xmlns:am3d="http://schemas.microsoft.com/office/drawing/2017/model3d" xmlns:o="urn:schemas-microsoft-com:office:office" xmlns:oel="http://schemas.microsoft.com/office/2019/extlst" xmlns:r="http://schemas.openxmlformats.org/officeDocument/2006/relationships" xmlns:m="http://schemas.openxmlformats.org/officeDocument/2006/math" xmlns:v="urn:schemas-microsoft-com:vml" xmlns:wp14="http://schemas.microsoft.com/office/word/2010/wordprocessingDrawing" xmlns:wp="http://schemas.openxmlformats.org/drawingml/2006/wordprocessingDrawing" xmlns:w10="urn:schemas-microsoft-com:office:word" xmlns:w="http://schemas.openxmlformats.org/wordprocessingml/2006/main" xmlns:w14="http://schemas.microsoft.com/office/word/2010/wordml" xmlns:w15="http://schemas.microsoft.com/office/word/2012/wordml" xmlns:w16cex="http://schemas.microsoft.com/office/word/2018/wordml/cex" xmlns:w16cid="http://schemas.microsoft.com/office/word/2016/wordml/cid" xmlns:w16="http://schemas.microsoft.com/office/word/2018/wordml" xmlns:w16du="http://schemas.microsoft.com/office/word/2023/wordml/word16du" xmlns:w16sdtdh="http://schemas.microsoft.com/office/word/2020/wordml/sdtdatahash" xmlns:w16se="http://schemas.microsoft.com/office/word/2015/wordml/symex" xmlns:wpg="http://schemas.microsoft.com/office/word/2010/wordprocessingGroup" xmlns:wpi="http://schemas.microsoft.com/office/word/2010/wordprocessingInk" xmlns:wne="http://schemas.microsoft.com/office/word/2006/wordml" xmlns:wps="http://schemas.microsoft.com/office/word/2010/wordprocessingShape" mc:Ignorable="w14 w15 w16se w16cid w16 w16cex w16sdtdh w16du wp14">
+<w:document xmlns:wpc="http://schemas.microsoft.com/office/word/2010/wordprocessingCanvas" xmlns:cx="http://schemas.microsoft.com/office/drawing/2014/chartex" xmlns:cx1="http://schemas.microsoft.com/office/drawing/2015/9/8/chartex" xmlns:cx2="http://schemas.microsoft.com/office/drawing/2015/10/21/chartex" xmlns:cx3="http://schemas.microsoft.com/office/drawing/2016/5/9/chartex" xmlns:cx4="http://schemas.microsoft.com/office/drawing/2016/5/10/chartex" xmlns:cx5="http://schemas.microsoft.com/office/drawing/2016/5/11/chartex" xmlns:cx6="http://schemas.microsoft.com/office/drawing/2016/5/12/chartex" xmlns:cx7="http://schemas.microsoft.com/office/drawing/2016/5/13/chartex" xmlns:cx8="http://schemas.microsoft.com/office/drawing/2016/5/14/chartex" xmlns:mc="http://schemas.openxmlformats.org/markup-compatibility/2006" xmlns:aink="http://schemas.microsoft.com/office/drawing/2016/ink" xmlns:am3d="http://schemas.microsoft.com/office/drawing/2017/model3d" xmlns:o="urn:schemas-microsoft-com:office:office" xmlns:oel="http://schemas.microsoft.com/office/2019/extlst" xmlns:r="http://schemas.openxmlformats.org/officeDocument/2006/relationships" xmlns:m="http://schemas.openxmlformats.org/officeDocument/2006/math" xmlns:v="urn:schemas-microsoft-com:vml" xmlns:wp14="http://schemas.microsoft.com/office/word/2010/wordprocessingDrawing" xmlns:wp="http://schemas.openxmlformats.org/drawingml/2006/wordprocessingDrawing" xmlns:w10="urn:schemas-microsoft-com:office:word" xmlns:w="http://schemas.openxmlformats.org/wordprocessingml/2006/main" xmlns:w14="http://schemas.microsoft.com/office/word/2010/wordml" xmlns:w15="http://schemas.microsoft.com/office/word/2012/wordml" xmlns:w16cex="http://schemas.microsoft.com/office/word/2018/wordml/cex" xmlns:w16cid="http://schemas.microsoft.com/office/word/2016/wordml/cid" xmlns:w16="http://schemas.microsoft.com/office/word/2018/wordml" xmlns:w16du="http://schemas.microsoft.com/office/word/2023/wordml/word16du" xmlns:w16sdtdh="http://schemas.microsoft.com/office/word/2020/wordml/sdtdatahash" xmlns:w16sdtfl="http://schemas.microsoft.com/office/word/2024/wordml/sdtformatlock" xmlns:w16se="http://schemas.microsoft.com/office/word/2015/wordml/symex" xmlns:wpg="http://schemas.microsoft.com/office/word/2010/wordprocessingGroup" xmlns:wpi="http://schemas.microsoft.com/office/word/2010/wordprocessingInk" xmlns:wne="http://schemas.microsoft.com/office/word/2006/wordml" xmlns:wps="http://schemas.microsoft.com/office/word/2010/wordprocessingShape" mc:Ignorable="w14 w15 w16se w16cid w16 w16cex w16sdtdh w16sdtfl w16du wp14">
   <w:body>
     <w:p>
       <w:pPr>
@@ -24,300 +24,146 @@
     </w:p>
     <w:p>
       <w:pPr>
-        <w:ind w:left="480" w:hanging="480"/>
+        <w:pStyle w:val="Els-body-text"/>
+      </w:pPr>
+    </w:p>
+    <w:p>
+      <w:pPr>
+        <w:pStyle w:val="Bibliography"/>
         <w:rPr>
-          <w:rFonts w:ascii="Times New Roman" w:eastAsia="Times New Roman" w:hAnsi="Times New Roman" w:cs="Times New Roman"/>
+          <w:rFonts w:ascii="Times New Roman" w:hAnsi="Times New Roman" w:cs="Times New Roman"/>
           <w:sz w:val="20"/>
-          <w:szCs w:val="20"/>
         </w:rPr>
       </w:pPr>
       <w:r>
         <w:rPr>
-          <w:rFonts w:ascii="Times New Roman" w:eastAsia="Times New Roman" w:hAnsi="Times New Roman" w:cs="Times New Roman"/>
+          <w:rFonts w:ascii="Times New Roman" w:hAnsi="Times New Roman" w:cs="Times New Roman"/>
           <w:sz w:val="20"/>
-          <w:szCs w:val="20"/>
         </w:rPr>
-        <w:t>Canada Energy Regulator (CER). (2023). </w:t>
+        <w:t>Navius Research. Canada Energy Dashboard [Internet]. 2023 [cited 2025 Dec 30]. Available from: https://canadaenergydashboard.com/index.html</w:t>
       </w:r>
-      <w:r>
-        <w:rPr>
-          <w:rFonts w:ascii="Times New Roman" w:eastAsia="Times New Roman" w:hAnsi="Times New Roman" w:cs="Times New Roman"/>
-          <w:i/>
-          <w:iCs/>
-          <w:sz w:val="20"/>
-          <w:szCs w:val="20"/>
-        </w:rPr>
-        <w:t>Canada’s Energy Future 2023: Energy Supply and Demand Projections to 2050</w:t>
-      </w:r>
-      <w:r>
-        <w:rPr>
-          <w:rFonts w:ascii="Times New Roman" w:eastAsia="Times New Roman" w:hAnsi="Times New Roman" w:cs="Times New Roman"/>
-          <w:sz w:val="20"/>
-          <w:szCs w:val="20"/>
-        </w:rPr>
-        <w:t>. Retrieved from </w:t>
-      </w:r>
-      <w:hyperlink r:id="rId8" w:tgtFrame="_new" w:history="1">
-        <w:r>
-          <w:rPr>
-            <w:rStyle w:val="Hyperlink"/>
-            <w:rFonts w:ascii="Times New Roman" w:eastAsia="Times New Roman" w:hAnsi="Times New Roman" w:cs="Times New Roman"/>
-            <w:color w:val="0432FF"/>
-            <w:sz w:val="20"/>
-            <w:szCs w:val="20"/>
-          </w:rPr>
-          <w:t>https://www.cer-rec.gc.ca/en/data-analysis/canada-energy-future/2023/</w:t>
-        </w:r>
-      </w:hyperlink>
     </w:p>
     <w:p>
       <w:pPr>
-        <w:ind w:left="480" w:hanging="480"/>
+        <w:pStyle w:val="Bibliography"/>
         <w:rPr>
-          <w:rFonts w:ascii="Times New Roman" w:eastAsia="Times New Roman" w:hAnsi="Times New Roman" w:cs="Times New Roman"/>
+          <w:rFonts w:ascii="Times New Roman" w:hAnsi="Times New Roman" w:cs="Times New Roman"/>
           <w:sz w:val="20"/>
-          <w:szCs w:val="20"/>
+        </w:rPr>
+      </w:pPr>
+    </w:p>
+    <w:p>
+      <w:pPr>
+        <w:pStyle w:val="Bibliography"/>
+        <w:rPr>
+          <w:rFonts w:ascii="Times New Roman" w:hAnsi="Times New Roman" w:cs="Times New Roman"/>
+          <w:sz w:val="20"/>
         </w:rPr>
       </w:pPr>
       <w:r>
         <w:rPr>
-          <w:rFonts w:ascii="Times New Roman" w:eastAsia="Times New Roman" w:hAnsi="Times New Roman" w:cs="Times New Roman"/>
+          <w:rFonts w:ascii="Times New Roman" w:hAnsi="Times New Roman" w:cs="Times New Roman"/>
           <w:sz w:val="20"/>
-          <w:szCs w:val="20"/>
         </w:rPr>
-        <w:t xml:space="preserve">Langlois-Bertrand, S., Mousseau, N., </w:t>
+        <w:t xml:space="preserve">Lecocq F, Winkler H, Daka JP, Fu S, Gerber JS, Kartha S, et al. Mitigation and Development Pathways in the Near to Mid-term. In: Intergovernmental Panel </w:t>
+      </w:r>
+      <w:proofErr w:type="gramStart"/>
+      <w:r>
+        <w:rPr>
+          <w:rFonts w:ascii="Times New Roman" w:hAnsi="Times New Roman" w:cs="Times New Roman"/>
+          <w:sz w:val="20"/>
+        </w:rPr>
+        <w:t>On</w:t>
+      </w:r>
+      <w:proofErr w:type="gramEnd"/>
+      <w:r>
+        <w:rPr>
+          <w:rFonts w:ascii="Times New Roman" w:hAnsi="Times New Roman" w:cs="Times New Roman"/>
+          <w:sz w:val="20"/>
+        </w:rPr>
+        <w:t xml:space="preserve"> Climate Change (</w:t>
       </w:r>
       <w:proofErr w:type="spellStart"/>
       <w:r>
         <w:rPr>
-          <w:rFonts w:ascii="Times New Roman" w:eastAsia="Times New Roman" w:hAnsi="Times New Roman" w:cs="Times New Roman"/>
+          <w:rFonts w:ascii="Times New Roman" w:hAnsi="Times New Roman" w:cs="Times New Roman"/>
           <w:sz w:val="20"/>
-          <w:szCs w:val="20"/>
         </w:rPr>
-        <w:t>Beaumier</w:t>
+        <w:t>Ipcc</w:t>
       </w:r>
       <w:proofErr w:type="spellEnd"/>
       <w:r>
         <w:rPr>
-          <w:rFonts w:ascii="Times New Roman" w:eastAsia="Times New Roman" w:hAnsi="Times New Roman" w:cs="Times New Roman"/>
+          <w:rFonts w:ascii="Times New Roman" w:hAnsi="Times New Roman" w:cs="Times New Roman"/>
           <w:sz w:val="20"/>
-          <w:szCs w:val="20"/>
         </w:rPr>
-        <w:t>, L., &amp; Bahn, O. (2021). </w:t>
+        <w:t>), editor. Climate Change 2022 - Mitigation of Climate Change [Internet]. 1st ed. Cambridge University Press; 2022 [cited 2025 Dec 30]. p. 409–502. Available from: https://www.cambridge.org/core/product/identifier/9781009157926%23c4/type/book_part</w:t>
       </w:r>
+    </w:p>
+    <w:p>
+      <w:pPr>
+        <w:pStyle w:val="Bibliography"/>
+        <w:rPr>
+          <w:rFonts w:ascii="Times New Roman" w:hAnsi="Times New Roman" w:cs="Times New Roman"/>
+          <w:sz w:val="20"/>
+        </w:rPr>
+      </w:pPr>
+    </w:p>
+    <w:p>
+      <w:pPr>
+        <w:pStyle w:val="Bibliography"/>
+        <w:rPr>
+          <w:rFonts w:ascii="Times New Roman" w:hAnsi="Times New Roman" w:cs="Times New Roman"/>
+          <w:sz w:val="20"/>
+        </w:rPr>
+      </w:pPr>
       <w:r>
         <w:rPr>
-          <w:rFonts w:ascii="Times New Roman" w:eastAsia="Times New Roman" w:hAnsi="Times New Roman" w:cs="Times New Roman"/>
-          <w:i/>
-          <w:iCs/>
+          <w:rFonts w:ascii="Times New Roman" w:hAnsi="Times New Roman" w:cs="Times New Roman"/>
           <w:sz w:val="20"/>
-          <w:szCs w:val="20"/>
         </w:rPr>
-        <w:t>Canadian Energy Outlook 2021: Horizon 2060</w:t>
+        <w:t>Canada Energy Regulator (CER). Canada’s Energy Future 2023: Energy Supply and Demand Projections to 2050 [Internet]. 2023 [cited 2025 Dec 30]. Available from: https://www.cer-rec.gc.ca/en/data-analysis/canada-energy-future/2023/</w:t>
       </w:r>
+    </w:p>
+    <w:p>
+      <w:pPr>
+        <w:pStyle w:val="Bibliography"/>
+        <w:rPr>
+          <w:rFonts w:ascii="Times New Roman" w:hAnsi="Times New Roman" w:cs="Times New Roman"/>
+          <w:sz w:val="20"/>
+        </w:rPr>
+      </w:pPr>
+    </w:p>
+    <w:p>
+      <w:pPr>
+        <w:pStyle w:val="Bibliography"/>
+        <w:rPr>
+          <w:rFonts w:ascii="Times New Roman" w:hAnsi="Times New Roman" w:cs="Times New Roman"/>
+          <w:sz w:val="20"/>
+        </w:rPr>
+      </w:pPr>
       <w:r>
         <w:rPr>
-          <w:rFonts w:ascii="Times New Roman" w:eastAsia="Times New Roman" w:hAnsi="Times New Roman" w:cs="Times New Roman"/>
+          <w:rFonts w:ascii="Times New Roman" w:hAnsi="Times New Roman" w:cs="Times New Roman"/>
           <w:sz w:val="20"/>
-          <w:szCs w:val="20"/>
         </w:rPr>
-        <w:t xml:space="preserve">. </w:t>
+        <w:t xml:space="preserve">Langlois-Bertrand S, Mousseau N, Beaumier L, Bahn O. Institut de </w:t>
       </w:r>
       <w:proofErr w:type="spellStart"/>
       <w:r>
         <w:rPr>
-          <w:rFonts w:ascii="Times New Roman" w:eastAsia="Times New Roman" w:hAnsi="Times New Roman" w:cs="Times New Roman"/>
+          <w:rFonts w:ascii="Times New Roman" w:hAnsi="Times New Roman" w:cs="Times New Roman"/>
           <w:sz w:val="20"/>
-          <w:szCs w:val="20"/>
-        </w:rPr>
-        <w:t>Institut</w:t>
-      </w:r>
-      <w:proofErr w:type="spellEnd"/>
-      <w:r>
-        <w:rPr>
-          <w:rFonts w:ascii="Times New Roman" w:eastAsia="Times New Roman" w:hAnsi="Times New Roman" w:cs="Times New Roman"/>
-          <w:sz w:val="20"/>
-          <w:szCs w:val="20"/>
-        </w:rPr>
-        <w:t xml:space="preserve"> de </w:t>
-      </w:r>
-      <w:proofErr w:type="spellStart"/>
-      <w:r>
-        <w:rPr>
-          <w:rFonts w:ascii="Times New Roman" w:eastAsia="Times New Roman" w:hAnsi="Times New Roman" w:cs="Times New Roman"/>
-          <w:sz w:val="20"/>
-          <w:szCs w:val="20"/>
         </w:rPr>
         <w:t>l’énergie</w:t>
       </w:r>
       <w:proofErr w:type="spellEnd"/>
       <w:r>
         <w:rPr>
-          <w:rFonts w:ascii="Times New Roman" w:eastAsia="Times New Roman" w:hAnsi="Times New Roman" w:cs="Times New Roman"/>
+          <w:rFonts w:ascii="Times New Roman" w:hAnsi="Times New Roman" w:cs="Times New Roman"/>
           <w:sz w:val="20"/>
-          <w:szCs w:val="20"/>
         </w:rPr>
-        <w:t xml:space="preserve"> Trottier. Retrieved from </w:t>
-      </w:r>
-      <w:hyperlink r:id="rId9" w:tgtFrame="_new" w:history="1">
-        <w:r>
-          <w:rPr>
-            <w:rStyle w:val="Hyperlink"/>
-            <w:rFonts w:ascii="Times New Roman" w:eastAsia="Times New Roman" w:hAnsi="Times New Roman" w:cs="Times New Roman"/>
-            <w:color w:val="0432FF"/>
-            <w:sz w:val="20"/>
-            <w:szCs w:val="20"/>
-          </w:rPr>
-          <w:t>https://iet.polymtl.ca/wp-content/uploads/delightful-downloads/CEO2021_20211112.pdf</w:t>
-        </w:r>
-      </w:hyperlink>
-    </w:p>
-    <w:p>
-      <w:pPr>
-        <w:ind w:left="480" w:hanging="480"/>
-        <w:rPr>
-          <w:rFonts w:ascii="Times New Roman" w:eastAsia="Times New Roman" w:hAnsi="Times New Roman" w:cs="Times New Roman"/>
-          <w:sz w:val="20"/>
-          <w:szCs w:val="20"/>
-        </w:rPr>
-      </w:pPr>
-      <w:r>
-        <w:rPr>
-          <w:rFonts w:ascii="Times New Roman" w:eastAsia="Times New Roman" w:hAnsi="Times New Roman" w:cs="Times New Roman"/>
-          <w:sz w:val="20"/>
-          <w:szCs w:val="20"/>
-        </w:rPr>
-        <w:t xml:space="preserve">Lecocq, F., Winkler, H., Daka, J. P., Fu, S., Gerber, J. S., </w:t>
-      </w:r>
-      <w:proofErr w:type="spellStart"/>
-      <w:r>
-        <w:rPr>
-          <w:rFonts w:ascii="Times New Roman" w:eastAsia="Times New Roman" w:hAnsi="Times New Roman" w:cs="Times New Roman"/>
-          <w:sz w:val="20"/>
-          <w:szCs w:val="20"/>
-        </w:rPr>
-        <w:t>Kartha</w:t>
-      </w:r>
-      <w:proofErr w:type="spellEnd"/>
-      <w:r>
-        <w:rPr>
-          <w:rFonts w:ascii="Times New Roman" w:eastAsia="Times New Roman" w:hAnsi="Times New Roman" w:cs="Times New Roman"/>
-          <w:sz w:val="20"/>
-          <w:szCs w:val="20"/>
-        </w:rPr>
-        <w:t xml:space="preserve">, S., </w:t>
-      </w:r>
-      <w:proofErr w:type="spellStart"/>
-      <w:r>
-        <w:rPr>
-          <w:rFonts w:ascii="Times New Roman" w:eastAsia="Times New Roman" w:hAnsi="Times New Roman" w:cs="Times New Roman"/>
-          <w:sz w:val="20"/>
-          <w:szCs w:val="20"/>
-        </w:rPr>
-        <w:t>Krey</w:t>
-      </w:r>
-      <w:proofErr w:type="spellEnd"/>
-      <w:r>
-        <w:rPr>
-          <w:rFonts w:ascii="Times New Roman" w:eastAsia="Times New Roman" w:hAnsi="Times New Roman" w:cs="Times New Roman"/>
-          <w:sz w:val="20"/>
-          <w:szCs w:val="20"/>
-        </w:rPr>
-        <w:t xml:space="preserve">, V., Lofgren, H., Masui, T., Mathur, R., Portugal-Pereira, J., </w:t>
-      </w:r>
-      <w:proofErr w:type="spellStart"/>
-      <w:r>
-        <w:rPr>
-          <w:rFonts w:ascii="Times New Roman" w:eastAsia="Times New Roman" w:hAnsi="Times New Roman" w:cs="Times New Roman"/>
-          <w:sz w:val="20"/>
-          <w:szCs w:val="20"/>
-        </w:rPr>
-        <w:t>Sovacool</w:t>
-      </w:r>
-      <w:proofErr w:type="spellEnd"/>
-      <w:r>
-        <w:rPr>
-          <w:rFonts w:ascii="Times New Roman" w:eastAsia="Times New Roman" w:hAnsi="Times New Roman" w:cs="Times New Roman"/>
-          <w:sz w:val="20"/>
-          <w:szCs w:val="20"/>
-        </w:rPr>
-        <w:t xml:space="preserve">, B. K., </w:t>
-      </w:r>
-      <w:proofErr w:type="spellStart"/>
-      <w:r>
-        <w:rPr>
-          <w:rFonts w:ascii="Times New Roman" w:eastAsia="Times New Roman" w:hAnsi="Times New Roman" w:cs="Times New Roman"/>
-          <w:sz w:val="20"/>
-          <w:szCs w:val="20"/>
-        </w:rPr>
-        <w:t>Vilariño</w:t>
-      </w:r>
-      <w:proofErr w:type="spellEnd"/>
-      <w:r>
-        <w:rPr>
-          <w:rFonts w:ascii="Times New Roman" w:eastAsia="Times New Roman" w:hAnsi="Times New Roman" w:cs="Times New Roman"/>
-          <w:sz w:val="20"/>
-          <w:szCs w:val="20"/>
-        </w:rPr>
-        <w:t>, M. V., &amp; Zhou, N. (2022). Mitigation and development pathways in the near- to mid-term. In Intergovernmental Panel on Climate Change (Ed.), </w:t>
-      </w:r>
-      <w:r>
-        <w:rPr>
-          <w:rFonts w:ascii="Times New Roman" w:eastAsia="Times New Roman" w:hAnsi="Times New Roman" w:cs="Times New Roman"/>
-          <w:i/>
-          <w:iCs/>
-          <w:sz w:val="20"/>
-          <w:szCs w:val="20"/>
-        </w:rPr>
-        <w:t>Mitigation of climate change</w:t>
-      </w:r>
-      <w:r>
-        <w:rPr>
-          <w:rFonts w:ascii="Times New Roman" w:eastAsia="Times New Roman" w:hAnsi="Times New Roman" w:cs="Times New Roman"/>
-          <w:sz w:val="20"/>
-          <w:szCs w:val="20"/>
-        </w:rPr>
-        <w:t> (Chapter 4). IPCC. Retrieved from </w:t>
-      </w:r>
-      <w:hyperlink r:id="rId10" w:tgtFrame="_new" w:history="1">
-        <w:r>
-          <w:rPr>
-            <w:rStyle w:val="Hyperlink"/>
-            <w:rFonts w:ascii="Times New Roman" w:eastAsia="Times New Roman" w:hAnsi="Times New Roman" w:cs="Times New Roman"/>
-            <w:color w:val="0432FF"/>
-            <w:sz w:val="20"/>
-            <w:szCs w:val="20"/>
-          </w:rPr>
-          <w:t>https://www.ipcc.ch/report/ar6/wg3/downloads/report/IPCC_AR6_WGIII_Chapter04.pdf</w:t>
-        </w:r>
-      </w:hyperlink>
-    </w:p>
-    <w:p>
-      <w:pPr>
-        <w:ind w:left="480" w:hanging="480"/>
-        <w:rPr>
-          <w:rFonts w:ascii="Times New Roman" w:eastAsia="Times New Roman" w:hAnsi="Times New Roman" w:cs="Times New Roman"/>
-          <w:sz w:val="20"/>
-          <w:szCs w:val="20"/>
-        </w:rPr>
-      </w:pPr>
-      <w:r>
-        <w:rPr>
-          <w:rFonts w:ascii="Times New Roman" w:eastAsia="Times New Roman" w:hAnsi="Times New Roman" w:cs="Times New Roman"/>
-          <w:sz w:val="20"/>
-          <w:szCs w:val="20"/>
-        </w:rPr>
-        <w:t xml:space="preserve">Navius Research. (2023). Canada Energy Dashboard. Available at: </w:t>
-      </w:r>
-      <w:r>
-        <w:rPr>
-          <w:rFonts w:ascii="Times New Roman" w:eastAsia="Times New Roman" w:hAnsi="Times New Roman" w:cs="Times New Roman"/>
-          <w:color w:val="0432FF"/>
-          <w:sz w:val="20"/>
-          <w:szCs w:val="20"/>
-          <w:u w:val="single"/>
-        </w:rPr>
-        <w:t>canadaenergydashboard.com</w:t>
+        <w:t xml:space="preserve"> Trottier. 2021 [cited 2025 Dec 30]. Canadian Energy Outlook 2021: Horizon 2060. Available from: https://iet.studioazura.com/en/publications/rapport/perspectives-energetiques-canadiennes-2021</w:t>
       </w:r>
     </w:p>
     <w:p>
@@ -330,9 +176,9 @@
       </w:pPr>
     </w:p>
     <w:sectPr>
-      <w:headerReference w:type="default" r:id="rId11"/>
-      <w:footerReference w:type="even" r:id="rId12"/>
-      <w:footerReference w:type="default" r:id="rId13"/>
+      <w:headerReference w:type="default" r:id="rId8"/>
+      <w:footerReference w:type="even" r:id="rId9"/>
+      <w:footerReference w:type="default" r:id="rId10"/>
       <w:pgSz w:w="12240" w:h="15840"/>
       <w:pgMar w:top="1440" w:right="1440" w:bottom="1440" w:left="1440" w:header="720" w:footer="720" w:gutter="0"/>
       <w:cols w:space="720"/>
@@ -343,7 +189,7 @@
 </file>
 
 <file path=word/endnotes.xml><?xml version="1.0" encoding="utf-8"?>
-<w:endnotes xmlns:wpc="http://schemas.microsoft.com/office/word/2010/wordprocessingCanvas" xmlns:cx="http://schemas.microsoft.com/office/drawing/2014/chartex" xmlns:cx1="http://schemas.microsoft.com/office/drawing/2015/9/8/chartex" xmlns:cx2="http://schemas.microsoft.com/office/drawing/2015/10/21/chartex" xmlns:cx3="http://schemas.microsoft.com/office/drawing/2016/5/9/chartex" xmlns:cx4="http://schemas.microsoft.com/office/drawing/2016/5/10/chartex" xmlns:cx5="http://schemas.microsoft.com/office/drawing/2016/5/11/chartex" xmlns:cx6="http://schemas.microsoft.com/office/drawing/2016/5/12/chartex" xmlns:cx7="http://schemas.microsoft.com/office/drawing/2016/5/13/chartex" xmlns:cx8="http://schemas.microsoft.com/office/drawing/2016/5/14/chartex" xmlns:mc="http://schemas.openxmlformats.org/markup-compatibility/2006" xmlns:aink="http://schemas.microsoft.com/office/drawing/2016/ink" xmlns:am3d="http://schemas.microsoft.com/office/drawing/2017/model3d" xmlns:o="urn:schemas-microsoft-com:office:office" xmlns:oel="http://schemas.microsoft.com/office/2019/extlst" xmlns:r="http://schemas.openxmlformats.org/officeDocument/2006/relationships" xmlns:m="http://schemas.openxmlformats.org/officeDocument/2006/math" xmlns:v="urn:schemas-microsoft-com:vml" xmlns:wp14="http://schemas.microsoft.com/office/word/2010/wordprocessingDrawing" xmlns:wp="http://schemas.openxmlformats.org/drawingml/2006/wordprocessingDrawing" xmlns:w10="urn:schemas-microsoft-com:office:word" xmlns:w="http://schemas.openxmlformats.org/wordprocessingml/2006/main" xmlns:w14="http://schemas.microsoft.com/office/word/2010/wordml" xmlns:w15="http://schemas.microsoft.com/office/word/2012/wordml" xmlns:w16cex="http://schemas.microsoft.com/office/word/2018/wordml/cex" xmlns:w16cid="http://schemas.microsoft.com/office/word/2016/wordml/cid" xmlns:w16="http://schemas.microsoft.com/office/word/2018/wordml" xmlns:w16du="http://schemas.microsoft.com/office/word/2023/wordml/word16du" xmlns:w16sdtdh="http://schemas.microsoft.com/office/word/2020/wordml/sdtdatahash" xmlns:w16se="http://schemas.microsoft.com/office/word/2015/wordml/symex" xmlns:wpg="http://schemas.microsoft.com/office/word/2010/wordprocessingGroup" xmlns:wpi="http://schemas.microsoft.com/office/word/2010/wordprocessingInk" xmlns:wne="http://schemas.microsoft.com/office/word/2006/wordml" xmlns:wps="http://schemas.microsoft.com/office/word/2010/wordprocessingShape" mc:Ignorable="w14 w15 w16se w16cid w16 w16cex w16sdtdh w16du wp14">
+<w:endnotes xmlns:wpc="http://schemas.microsoft.com/office/word/2010/wordprocessingCanvas" xmlns:cx="http://schemas.microsoft.com/office/drawing/2014/chartex" xmlns:cx1="http://schemas.microsoft.com/office/drawing/2015/9/8/chartex" xmlns:cx2="http://schemas.microsoft.com/office/drawing/2015/10/21/chartex" xmlns:cx3="http://schemas.microsoft.com/office/drawing/2016/5/9/chartex" xmlns:cx4="http://schemas.microsoft.com/office/drawing/2016/5/10/chartex" xmlns:cx5="http://schemas.microsoft.com/office/drawing/2016/5/11/chartex" xmlns:cx6="http://schemas.microsoft.com/office/drawing/2016/5/12/chartex" xmlns:cx7="http://schemas.microsoft.com/office/drawing/2016/5/13/chartex" xmlns:cx8="http://schemas.microsoft.com/office/drawing/2016/5/14/chartex" xmlns:mc="http://schemas.openxmlformats.org/markup-compatibility/2006" xmlns:aink="http://schemas.microsoft.com/office/drawing/2016/ink" xmlns:am3d="http://schemas.microsoft.com/office/drawing/2017/model3d" xmlns:o="urn:schemas-microsoft-com:office:office" xmlns:oel="http://schemas.microsoft.com/office/2019/extlst" xmlns:r="http://schemas.openxmlformats.org/officeDocument/2006/relationships" xmlns:m="http://schemas.openxmlformats.org/officeDocument/2006/math" xmlns:v="urn:schemas-microsoft-com:vml" xmlns:wp14="http://schemas.microsoft.com/office/word/2010/wordprocessingDrawing" xmlns:wp="http://schemas.openxmlformats.org/drawingml/2006/wordprocessingDrawing" xmlns:w10="urn:schemas-microsoft-com:office:word" xmlns:w="http://schemas.openxmlformats.org/wordprocessingml/2006/main" xmlns:w14="http://schemas.microsoft.com/office/word/2010/wordml" xmlns:w15="http://schemas.microsoft.com/office/word/2012/wordml" xmlns:w16cex="http://schemas.microsoft.com/office/word/2018/wordml/cex" xmlns:w16cid="http://schemas.microsoft.com/office/word/2016/wordml/cid" xmlns:w16="http://schemas.microsoft.com/office/word/2018/wordml" xmlns:w16du="http://schemas.microsoft.com/office/word/2023/wordml/word16du" xmlns:w16sdtdh="http://schemas.microsoft.com/office/word/2020/wordml/sdtdatahash" xmlns:w16sdtfl="http://schemas.microsoft.com/office/word/2024/wordml/sdtformatlock" xmlns:w16se="http://schemas.microsoft.com/office/word/2015/wordml/symex" xmlns:wpg="http://schemas.microsoft.com/office/word/2010/wordprocessingGroup" xmlns:wpi="http://schemas.microsoft.com/office/word/2010/wordprocessingInk" xmlns:wne="http://schemas.microsoft.com/office/word/2006/wordml" xmlns:wps="http://schemas.microsoft.com/office/word/2010/wordprocessingShape" mc:Ignorable="w14 w15 w16se w16cid w16 w16cex w16sdtdh w16sdtfl w16du wp14">
   <w:endnote w:type="separator" w:id="-1">
     <w:p>
       <w:r>
@@ -362,7 +208,7 @@
 </file>
 
 <file path=word/footer1.xml><?xml version="1.0" encoding="utf-8"?>
-<w:ftr xmlns:wpc="http://schemas.microsoft.com/office/word/2010/wordprocessingCanvas" xmlns:cx="http://schemas.microsoft.com/office/drawing/2014/chartex" xmlns:cx1="http://schemas.microsoft.com/office/drawing/2015/9/8/chartex" xmlns:cx2="http://schemas.microsoft.com/office/drawing/2015/10/21/chartex" xmlns:cx3="http://schemas.microsoft.com/office/drawing/2016/5/9/chartex" xmlns:cx4="http://schemas.microsoft.com/office/drawing/2016/5/10/chartex" xmlns:cx5="http://schemas.microsoft.com/office/drawing/2016/5/11/chartex" xmlns:cx6="http://schemas.microsoft.com/office/drawing/2016/5/12/chartex" xmlns:cx7="http://schemas.microsoft.com/office/drawing/2016/5/13/chartex" xmlns:cx8="http://schemas.microsoft.com/office/drawing/2016/5/14/chartex" xmlns:mc="http://schemas.openxmlformats.org/markup-compatibility/2006" xmlns:aink="http://schemas.microsoft.com/office/drawing/2016/ink" xmlns:am3d="http://schemas.microsoft.com/office/drawing/2017/model3d" xmlns:o="urn:schemas-microsoft-com:office:office" xmlns:oel="http://schemas.microsoft.com/office/2019/extlst" xmlns:r="http://schemas.openxmlformats.org/officeDocument/2006/relationships" xmlns:m="http://schemas.openxmlformats.org/officeDocument/2006/math" xmlns:v="urn:schemas-microsoft-com:vml" xmlns:wp14="http://schemas.microsoft.com/office/word/2010/wordprocessingDrawing" xmlns:wp="http://schemas.openxmlformats.org/drawingml/2006/wordprocessingDrawing" xmlns:w10="urn:schemas-microsoft-com:office:word" xmlns:w="http://schemas.openxmlformats.org/wordprocessingml/2006/main" xmlns:w14="http://schemas.microsoft.com/office/word/2010/wordml" xmlns:w15="http://schemas.microsoft.com/office/word/2012/wordml" xmlns:w16cex="http://schemas.microsoft.com/office/word/2018/wordml/cex" xmlns:w16cid="http://schemas.microsoft.com/office/word/2016/wordml/cid" xmlns:w16="http://schemas.microsoft.com/office/word/2018/wordml" xmlns:w16du="http://schemas.microsoft.com/office/word/2023/wordml/word16du" xmlns:w16sdtdh="http://schemas.microsoft.com/office/word/2020/wordml/sdtdatahash" xmlns:w16se="http://schemas.microsoft.com/office/word/2015/wordml/symex" xmlns:wpg="http://schemas.microsoft.com/office/word/2010/wordprocessingGroup" xmlns:wpi="http://schemas.microsoft.com/office/word/2010/wordprocessingInk" xmlns:wne="http://schemas.microsoft.com/office/word/2006/wordml" xmlns:wps="http://schemas.microsoft.com/office/word/2010/wordprocessingShape" mc:Ignorable="w14 w15 w16se w16cid w16 w16cex w16sdtdh w16du wp14">
+<w:ftr xmlns:wpc="http://schemas.microsoft.com/office/word/2010/wordprocessingCanvas" xmlns:cx="http://schemas.microsoft.com/office/drawing/2014/chartex" xmlns:cx1="http://schemas.microsoft.com/office/drawing/2015/9/8/chartex" xmlns:cx2="http://schemas.microsoft.com/office/drawing/2015/10/21/chartex" xmlns:cx3="http://schemas.microsoft.com/office/drawing/2016/5/9/chartex" xmlns:cx4="http://schemas.microsoft.com/office/drawing/2016/5/10/chartex" xmlns:cx5="http://schemas.microsoft.com/office/drawing/2016/5/11/chartex" xmlns:cx6="http://schemas.microsoft.com/office/drawing/2016/5/12/chartex" xmlns:cx7="http://schemas.microsoft.com/office/drawing/2016/5/13/chartex" xmlns:cx8="http://schemas.microsoft.com/office/drawing/2016/5/14/chartex" xmlns:mc="http://schemas.openxmlformats.org/markup-compatibility/2006" xmlns:aink="http://schemas.microsoft.com/office/drawing/2016/ink" xmlns:am3d="http://schemas.microsoft.com/office/drawing/2017/model3d" xmlns:o="urn:schemas-microsoft-com:office:office" xmlns:oel="http://schemas.microsoft.com/office/2019/extlst" xmlns:r="http://schemas.openxmlformats.org/officeDocument/2006/relationships" xmlns:m="http://schemas.openxmlformats.org/officeDocument/2006/math" xmlns:v="urn:schemas-microsoft-com:vml" xmlns:wp14="http://schemas.microsoft.com/office/word/2010/wordprocessingDrawing" xmlns:wp="http://schemas.openxmlformats.org/drawingml/2006/wordprocessingDrawing" xmlns:w10="urn:schemas-microsoft-com:office:word" xmlns:w="http://schemas.openxmlformats.org/wordprocessingml/2006/main" xmlns:w14="http://schemas.microsoft.com/office/word/2010/wordml" xmlns:w15="http://schemas.microsoft.com/office/word/2012/wordml" xmlns:w16cex="http://schemas.microsoft.com/office/word/2018/wordml/cex" xmlns:w16cid="http://schemas.microsoft.com/office/word/2016/wordml/cid" xmlns:w16="http://schemas.microsoft.com/office/word/2018/wordml" xmlns:w16du="http://schemas.microsoft.com/office/word/2023/wordml/word16du" xmlns:w16sdtdh="http://schemas.microsoft.com/office/word/2020/wordml/sdtdatahash" xmlns:w16sdtfl="http://schemas.microsoft.com/office/word/2024/wordml/sdtformatlock" xmlns:w16se="http://schemas.microsoft.com/office/word/2015/wordml/symex" xmlns:wpg="http://schemas.microsoft.com/office/word/2010/wordprocessingGroup" xmlns:wpi="http://schemas.microsoft.com/office/word/2010/wordprocessingInk" xmlns:wne="http://schemas.microsoft.com/office/word/2006/wordml" xmlns:wps="http://schemas.microsoft.com/office/word/2010/wordprocessingShape" mc:Ignorable="w14 w15 w16se w16cid w16 w16cex w16sdtdh w16sdtfl w16du wp14">
   <w:sdt>
     <w:sdtPr>
       <w:rPr>
@@ -414,7 +260,7 @@
 </file>
 
 <file path=word/footer2.xml><?xml version="1.0" encoding="utf-8"?>
-<w:ftr xmlns:wpc="http://schemas.microsoft.com/office/word/2010/wordprocessingCanvas" xmlns:cx="http://schemas.microsoft.com/office/drawing/2014/chartex" xmlns:cx1="http://schemas.microsoft.com/office/drawing/2015/9/8/chartex" xmlns:cx2="http://schemas.microsoft.com/office/drawing/2015/10/21/chartex" xmlns:cx3="http://schemas.microsoft.com/office/drawing/2016/5/9/chartex" xmlns:cx4="http://schemas.microsoft.com/office/drawing/2016/5/10/chartex" xmlns:cx5="http://schemas.microsoft.com/office/drawing/2016/5/11/chartex" xmlns:cx6="http://schemas.microsoft.com/office/drawing/2016/5/12/chartex" xmlns:cx7="http://schemas.microsoft.com/office/drawing/2016/5/13/chartex" xmlns:cx8="http://schemas.microsoft.com/office/drawing/2016/5/14/chartex" xmlns:mc="http://schemas.openxmlformats.org/markup-compatibility/2006" xmlns:aink="http://schemas.microsoft.com/office/drawing/2016/ink" xmlns:am3d="http://schemas.microsoft.com/office/drawing/2017/model3d" xmlns:o="urn:schemas-microsoft-com:office:office" xmlns:oel="http://schemas.microsoft.com/office/2019/extlst" xmlns:r="http://schemas.openxmlformats.org/officeDocument/2006/relationships" xmlns:m="http://schemas.openxmlformats.org/officeDocument/2006/math" xmlns:v="urn:schemas-microsoft-com:vml" xmlns:wp14="http://schemas.microsoft.com/office/word/2010/wordprocessingDrawing" xmlns:wp="http://schemas.openxmlformats.org/drawingml/2006/wordprocessingDrawing" xmlns:w10="urn:schemas-microsoft-com:office:word" xmlns:w="http://schemas.openxmlformats.org/wordprocessingml/2006/main" xmlns:w14="http://schemas.microsoft.com/office/word/2010/wordml" xmlns:w15="http://schemas.microsoft.com/office/word/2012/wordml" xmlns:w16cex="http://schemas.microsoft.com/office/word/2018/wordml/cex" xmlns:w16cid="http://schemas.microsoft.com/office/word/2016/wordml/cid" xmlns:w16="http://schemas.microsoft.com/office/word/2018/wordml" xmlns:w16du="http://schemas.microsoft.com/office/word/2023/wordml/word16du" xmlns:w16sdtdh="http://schemas.microsoft.com/office/word/2020/wordml/sdtdatahash" xmlns:w16se="http://schemas.microsoft.com/office/word/2015/wordml/symex" xmlns:wpg="http://schemas.microsoft.com/office/word/2010/wordprocessingGroup" xmlns:wpi="http://schemas.microsoft.com/office/word/2010/wordprocessingInk" xmlns:wne="http://schemas.microsoft.com/office/word/2006/wordml" xmlns:wps="http://schemas.microsoft.com/office/word/2010/wordprocessingShape" mc:Ignorable="w14 w15 w16se w16cid w16 w16cex w16sdtdh w16du wp14">
+<w:ftr xmlns:wpc="http://schemas.microsoft.com/office/word/2010/wordprocessingCanvas" xmlns:cx="http://schemas.microsoft.com/office/drawing/2014/chartex" xmlns:cx1="http://schemas.microsoft.com/office/drawing/2015/9/8/chartex" xmlns:cx2="http://schemas.microsoft.com/office/drawing/2015/10/21/chartex" xmlns:cx3="http://schemas.microsoft.com/office/drawing/2016/5/9/chartex" xmlns:cx4="http://schemas.microsoft.com/office/drawing/2016/5/10/chartex" xmlns:cx5="http://schemas.microsoft.com/office/drawing/2016/5/11/chartex" xmlns:cx6="http://schemas.microsoft.com/office/drawing/2016/5/12/chartex" xmlns:cx7="http://schemas.microsoft.com/office/drawing/2016/5/13/chartex" xmlns:cx8="http://schemas.microsoft.com/office/drawing/2016/5/14/chartex" xmlns:mc="http://schemas.openxmlformats.org/markup-compatibility/2006" xmlns:aink="http://schemas.microsoft.com/office/drawing/2016/ink" xmlns:am3d="http://schemas.microsoft.com/office/drawing/2017/model3d" xmlns:o="urn:schemas-microsoft-com:office:office" xmlns:oel="http://schemas.microsoft.com/office/2019/extlst" xmlns:r="http://schemas.openxmlformats.org/officeDocument/2006/relationships" xmlns:m="http://schemas.openxmlformats.org/officeDocument/2006/math" xmlns:v="urn:schemas-microsoft-com:vml" xmlns:wp14="http://schemas.microsoft.com/office/word/2010/wordprocessingDrawing" xmlns:wp="http://schemas.openxmlformats.org/drawingml/2006/wordprocessingDrawing" xmlns:w10="urn:schemas-microsoft-com:office:word" xmlns:w="http://schemas.openxmlformats.org/wordprocessingml/2006/main" xmlns:w14="http://schemas.microsoft.com/office/word/2010/wordml" xmlns:w15="http://schemas.microsoft.com/office/word/2012/wordml" xmlns:w16cex="http://schemas.microsoft.com/office/word/2018/wordml/cex" xmlns:w16cid="http://schemas.microsoft.com/office/word/2016/wordml/cid" xmlns:w16="http://schemas.microsoft.com/office/word/2018/wordml" xmlns:w16du="http://schemas.microsoft.com/office/word/2023/wordml/word16du" xmlns:w16sdtdh="http://schemas.microsoft.com/office/word/2020/wordml/sdtdatahash" xmlns:w16sdtfl="http://schemas.microsoft.com/office/word/2024/wordml/sdtformatlock" xmlns:w16se="http://schemas.microsoft.com/office/word/2015/wordml/symex" xmlns:wpg="http://schemas.microsoft.com/office/word/2010/wordprocessingGroup" xmlns:wpi="http://schemas.microsoft.com/office/word/2010/wordprocessingInk" xmlns:wne="http://schemas.microsoft.com/office/word/2006/wordml" xmlns:wps="http://schemas.microsoft.com/office/word/2010/wordprocessingShape" mc:Ignorable="w14 w15 w16se w16cid w16 w16cex w16sdtdh w16sdtfl w16du wp14">
   <w:sdt>
     <w:sdtPr>
       <w:rPr>
@@ -479,7 +325,7 @@
 </file>
 
 <file path=word/footnotes.xml><?xml version="1.0" encoding="utf-8"?>
-<w:footnotes xmlns:wpc="http://schemas.microsoft.com/office/word/2010/wordprocessingCanvas" xmlns:cx="http://schemas.microsoft.com/office/drawing/2014/chartex" xmlns:cx1="http://schemas.microsoft.com/office/drawing/2015/9/8/chartex" xmlns:cx2="http://schemas.microsoft.com/office/drawing/2015/10/21/chartex" xmlns:cx3="http://schemas.microsoft.com/office/drawing/2016/5/9/chartex" xmlns:cx4="http://schemas.microsoft.com/office/drawing/2016/5/10/chartex" xmlns:cx5="http://schemas.microsoft.com/office/drawing/2016/5/11/chartex" xmlns:cx6="http://schemas.microsoft.com/office/drawing/2016/5/12/chartex" xmlns:cx7="http://schemas.microsoft.com/office/drawing/2016/5/13/chartex" xmlns:cx8="http://schemas.microsoft.com/office/drawing/2016/5/14/chartex" xmlns:mc="http://schemas.openxmlformats.org/markup-compatibility/2006" xmlns:aink="http://schemas.microsoft.com/office/drawing/2016/ink" xmlns:am3d="http://schemas.microsoft.com/office/drawing/2017/model3d" xmlns:o="urn:schemas-microsoft-com:office:office" xmlns:oel="http://schemas.microsoft.com/office/2019/extlst" xmlns:r="http://schemas.openxmlformats.org/officeDocument/2006/relationships" xmlns:m="http://schemas.openxmlformats.org/officeDocument/2006/math" xmlns:v="urn:schemas-microsoft-com:vml" xmlns:wp14="http://schemas.microsoft.com/office/word/2010/wordprocessingDrawing" xmlns:wp="http://schemas.openxmlformats.org/drawingml/2006/wordprocessingDrawing" xmlns:w10="urn:schemas-microsoft-com:office:word" xmlns:w="http://schemas.openxmlformats.org/wordprocessingml/2006/main" xmlns:w14="http://schemas.microsoft.com/office/word/2010/wordml" xmlns:w15="http://schemas.microsoft.com/office/word/2012/wordml" xmlns:w16cex="http://schemas.microsoft.com/office/word/2018/wordml/cex" xmlns:w16cid="http://schemas.microsoft.com/office/word/2016/wordml/cid" xmlns:w16="http://schemas.microsoft.com/office/word/2018/wordml" xmlns:w16du="http://schemas.microsoft.com/office/word/2023/wordml/word16du" xmlns:w16sdtdh="http://schemas.microsoft.com/office/word/2020/wordml/sdtdatahash" xmlns:w16se="http://schemas.microsoft.com/office/word/2015/wordml/symex" xmlns:wpg="http://schemas.microsoft.com/office/word/2010/wordprocessingGroup" xmlns:wpi="http://schemas.microsoft.com/office/word/2010/wordprocessingInk" xmlns:wne="http://schemas.microsoft.com/office/word/2006/wordml" xmlns:wps="http://schemas.microsoft.com/office/word/2010/wordprocessingShape" mc:Ignorable="w14 w15 w16se w16cid w16 w16cex w16sdtdh w16du wp14">
+<w:footnotes xmlns:wpc="http://schemas.microsoft.com/office/word/2010/wordprocessingCanvas" xmlns:cx="http://schemas.microsoft.com/office/drawing/2014/chartex" xmlns:cx1="http://schemas.microsoft.com/office/drawing/2015/9/8/chartex" xmlns:cx2="http://schemas.microsoft.com/office/drawing/2015/10/21/chartex" xmlns:cx3="http://schemas.microsoft.com/office/drawing/2016/5/9/chartex" xmlns:cx4="http://schemas.microsoft.com/office/drawing/2016/5/10/chartex" xmlns:cx5="http://schemas.microsoft.com/office/drawing/2016/5/11/chartex" xmlns:cx6="http://schemas.microsoft.com/office/drawing/2016/5/12/chartex" xmlns:cx7="http://schemas.microsoft.com/office/drawing/2016/5/13/chartex" xmlns:cx8="http://schemas.microsoft.com/office/drawing/2016/5/14/chartex" xmlns:mc="http://schemas.openxmlformats.org/markup-compatibility/2006" xmlns:aink="http://schemas.microsoft.com/office/drawing/2016/ink" xmlns:am3d="http://schemas.microsoft.com/office/drawing/2017/model3d" xmlns:o="urn:schemas-microsoft-com:office:office" xmlns:oel="http://schemas.microsoft.com/office/2019/extlst" xmlns:r="http://schemas.openxmlformats.org/officeDocument/2006/relationships" xmlns:m="http://schemas.openxmlformats.org/officeDocument/2006/math" xmlns:v="urn:schemas-microsoft-com:vml" xmlns:wp14="http://schemas.microsoft.com/office/word/2010/wordprocessingDrawing" xmlns:wp="http://schemas.openxmlformats.org/drawingml/2006/wordprocessingDrawing" xmlns:w10="urn:schemas-microsoft-com:office:word" xmlns:w="http://schemas.openxmlformats.org/wordprocessingml/2006/main" xmlns:w14="http://schemas.microsoft.com/office/word/2010/wordml" xmlns:w15="http://schemas.microsoft.com/office/word/2012/wordml" xmlns:w16cex="http://schemas.microsoft.com/office/word/2018/wordml/cex" xmlns:w16cid="http://schemas.microsoft.com/office/word/2016/wordml/cid" xmlns:w16="http://schemas.microsoft.com/office/word/2018/wordml" xmlns:w16du="http://schemas.microsoft.com/office/word/2023/wordml/word16du" xmlns:w16sdtdh="http://schemas.microsoft.com/office/word/2020/wordml/sdtdatahash" xmlns:w16sdtfl="http://schemas.microsoft.com/office/word/2024/wordml/sdtformatlock" xmlns:w16se="http://schemas.microsoft.com/office/word/2015/wordml/symex" xmlns:wpg="http://schemas.microsoft.com/office/word/2010/wordprocessingGroup" xmlns:wpi="http://schemas.microsoft.com/office/word/2010/wordprocessingInk" xmlns:wne="http://schemas.microsoft.com/office/word/2006/wordml" xmlns:wps="http://schemas.microsoft.com/office/word/2010/wordprocessingShape" mc:Ignorable="w14 w15 w16se w16cid w16 w16cex w16sdtdh w16sdtfl w16du wp14">
   <w:footnote w:type="separator" w:id="-1">
     <w:p>
       <w:r>
@@ -498,7 +344,7 @@
 </file>
 
 <file path=word/header1.xml><?xml version="1.0" encoding="utf-8"?>
-<w:hdr xmlns:wpc="http://schemas.microsoft.com/office/word/2010/wordprocessingCanvas" xmlns:cx="http://schemas.microsoft.com/office/drawing/2014/chartex" xmlns:cx1="http://schemas.microsoft.com/office/drawing/2015/9/8/chartex" xmlns:cx2="http://schemas.microsoft.com/office/drawing/2015/10/21/chartex" xmlns:cx3="http://schemas.microsoft.com/office/drawing/2016/5/9/chartex" xmlns:cx4="http://schemas.microsoft.com/office/drawing/2016/5/10/chartex" xmlns:cx5="http://schemas.microsoft.com/office/drawing/2016/5/11/chartex" xmlns:cx6="http://schemas.microsoft.com/office/drawing/2016/5/12/chartex" xmlns:cx7="http://schemas.microsoft.com/office/drawing/2016/5/13/chartex" xmlns:cx8="http://schemas.microsoft.com/office/drawing/2016/5/14/chartex" xmlns:mc="http://schemas.openxmlformats.org/markup-compatibility/2006" xmlns:aink="http://schemas.microsoft.com/office/drawing/2016/ink" xmlns:am3d="http://schemas.microsoft.com/office/drawing/2017/model3d" xmlns:o="urn:schemas-microsoft-com:office:office" xmlns:oel="http://schemas.microsoft.com/office/2019/extlst" xmlns:r="http://schemas.openxmlformats.org/officeDocument/2006/relationships" xmlns:m="http://schemas.openxmlformats.org/officeDocument/2006/math" xmlns:v="urn:schemas-microsoft-com:vml" xmlns:wp14="http://schemas.microsoft.com/office/word/2010/wordprocessingDrawing" xmlns:wp="http://schemas.openxmlformats.org/drawingml/2006/wordprocessingDrawing" xmlns:w10="urn:schemas-microsoft-com:office:word" xmlns:w="http://schemas.openxmlformats.org/wordprocessingml/2006/main" xmlns:w14="http://schemas.microsoft.com/office/word/2010/wordml" xmlns:w15="http://schemas.microsoft.com/office/word/2012/wordml" xmlns:w16cex="http://schemas.microsoft.com/office/word/2018/wordml/cex" xmlns:w16cid="http://schemas.microsoft.com/office/word/2016/wordml/cid" xmlns:w16="http://schemas.microsoft.com/office/word/2018/wordml" xmlns:w16du="http://schemas.microsoft.com/office/word/2023/wordml/word16du" xmlns:w16sdtdh="http://schemas.microsoft.com/office/word/2020/wordml/sdtdatahash" xmlns:w16se="http://schemas.microsoft.com/office/word/2015/wordml/symex" xmlns:wpg="http://schemas.microsoft.com/office/word/2010/wordprocessingGroup" xmlns:wpi="http://schemas.microsoft.com/office/word/2010/wordprocessingInk" xmlns:wne="http://schemas.microsoft.com/office/word/2006/wordml" xmlns:wps="http://schemas.microsoft.com/office/word/2010/wordprocessingShape" mc:Ignorable="w14 w15 w16se w16cid w16 w16cex w16sdtdh w16du wp14">
+<w:hdr xmlns:wpc="http://schemas.microsoft.com/office/word/2010/wordprocessingCanvas" xmlns:cx="http://schemas.microsoft.com/office/drawing/2014/chartex" xmlns:cx1="http://schemas.microsoft.com/office/drawing/2015/9/8/chartex" xmlns:cx2="http://schemas.microsoft.com/office/drawing/2015/10/21/chartex" xmlns:cx3="http://schemas.microsoft.com/office/drawing/2016/5/9/chartex" xmlns:cx4="http://schemas.microsoft.com/office/drawing/2016/5/10/chartex" xmlns:cx5="http://schemas.microsoft.com/office/drawing/2016/5/11/chartex" xmlns:cx6="http://schemas.microsoft.com/office/drawing/2016/5/12/chartex" xmlns:cx7="http://schemas.microsoft.com/office/drawing/2016/5/13/chartex" xmlns:cx8="http://schemas.microsoft.com/office/drawing/2016/5/14/chartex" xmlns:mc="http://schemas.openxmlformats.org/markup-compatibility/2006" xmlns:aink="http://schemas.microsoft.com/office/drawing/2016/ink" xmlns:am3d="http://schemas.microsoft.com/office/drawing/2017/model3d" xmlns:o="urn:schemas-microsoft-com:office:office" xmlns:oel="http://schemas.microsoft.com/office/2019/extlst" xmlns:r="http://schemas.openxmlformats.org/officeDocument/2006/relationships" xmlns:m="http://schemas.openxmlformats.org/officeDocument/2006/math" xmlns:v="urn:schemas-microsoft-com:vml" xmlns:wp14="http://schemas.microsoft.com/office/word/2010/wordprocessingDrawing" xmlns:wp="http://schemas.openxmlformats.org/drawingml/2006/wordprocessingDrawing" xmlns:w10="urn:schemas-microsoft-com:office:word" xmlns:w="http://schemas.openxmlformats.org/wordprocessingml/2006/main" xmlns:w14="http://schemas.microsoft.com/office/word/2010/wordml" xmlns:w15="http://schemas.microsoft.com/office/word/2012/wordml" xmlns:w16cex="http://schemas.microsoft.com/office/word/2018/wordml/cex" xmlns:w16cid="http://schemas.microsoft.com/office/word/2016/wordml/cid" xmlns:w16="http://schemas.microsoft.com/office/word/2018/wordml" xmlns:w16du="http://schemas.microsoft.com/office/word/2023/wordml/word16du" xmlns:w16sdtdh="http://schemas.microsoft.com/office/word/2020/wordml/sdtdatahash" xmlns:w16sdtfl="http://schemas.microsoft.com/office/word/2024/wordml/sdtformatlock" xmlns:w16se="http://schemas.microsoft.com/office/word/2015/wordml/symex" xmlns:wpg="http://schemas.microsoft.com/office/word/2010/wordprocessingGroup" xmlns:wpi="http://schemas.microsoft.com/office/word/2010/wordprocessingInk" xmlns:wne="http://schemas.microsoft.com/office/word/2006/wordml" xmlns:wps="http://schemas.microsoft.com/office/word/2010/wordprocessingShape" mc:Ignorable="w14 w15 w16se w16cid w16 w16cex w16sdtdh w16sdtfl w16du wp14">
   <w:p>
     <w:pPr>
       <w:pStyle w:val="Header"/>
@@ -514,7 +360,7 @@
 </file>
 
 <file path=word/numbering.xml><?xml version="1.0" encoding="utf-8"?>
-<w:numbering xmlns:wpc="http://schemas.microsoft.com/office/word/2010/wordprocessingCanvas" xmlns:cx="http://schemas.microsoft.com/office/drawing/2014/chartex" xmlns:cx1="http://schemas.microsoft.com/office/drawing/2015/9/8/chartex" xmlns:cx2="http://schemas.microsoft.com/office/drawing/2015/10/21/chartex" xmlns:cx3="http://schemas.microsoft.com/office/drawing/2016/5/9/chartex" xmlns:cx4="http://schemas.microsoft.com/office/drawing/2016/5/10/chartex" xmlns:cx5="http://schemas.microsoft.com/office/drawing/2016/5/11/chartex" xmlns:cx6="http://schemas.microsoft.com/office/drawing/2016/5/12/chartex" xmlns:cx7="http://schemas.microsoft.com/office/drawing/2016/5/13/chartex" xmlns:cx8="http://schemas.microsoft.com/office/drawing/2016/5/14/chartex" xmlns:mc="http://schemas.openxmlformats.org/markup-compatibility/2006" xmlns:aink="http://schemas.microsoft.com/office/drawing/2016/ink" xmlns:am3d="http://schemas.microsoft.com/office/drawing/2017/model3d" xmlns:o="urn:schemas-microsoft-com:office:office" xmlns:oel="http://schemas.microsoft.com/office/2019/extlst" xmlns:r="http://schemas.openxmlformats.org/officeDocument/2006/relationships" xmlns:m="http://schemas.openxmlformats.org/officeDocument/2006/math" xmlns:v="urn:schemas-microsoft-com:vml" xmlns:wp14="http://schemas.microsoft.com/office/word/2010/wordprocessingDrawing" xmlns:wp="http://schemas.openxmlformats.org/drawingml/2006/wordprocessingDrawing" xmlns:w10="urn:schemas-microsoft-com:office:word" xmlns:w="http://schemas.openxmlformats.org/wordprocessingml/2006/main" xmlns:w14="http://schemas.microsoft.com/office/word/2010/wordml" xmlns:w15="http://schemas.microsoft.com/office/word/2012/wordml" xmlns:w16cex="http://schemas.microsoft.com/office/word/2018/wordml/cex" xmlns:w16cid="http://schemas.microsoft.com/office/word/2016/wordml/cid" xmlns:w16="http://schemas.microsoft.com/office/word/2018/wordml" xmlns:w16du="http://schemas.microsoft.com/office/word/2023/wordml/word16du" xmlns:w16sdtdh="http://schemas.microsoft.com/office/word/2020/wordml/sdtdatahash" xmlns:w16se="http://schemas.microsoft.com/office/word/2015/wordml/symex" xmlns:wpg="http://schemas.microsoft.com/office/word/2010/wordprocessingGroup" xmlns:wpi="http://schemas.microsoft.com/office/word/2010/wordprocessingInk" xmlns:wne="http://schemas.microsoft.com/office/word/2006/wordml" xmlns:wps="http://schemas.microsoft.com/office/word/2010/wordprocessingShape" mc:Ignorable="w14 w15 w16se w16cid w16 w16cex w16sdtdh w16du wp14">
+<w:numbering xmlns:wpc="http://schemas.microsoft.com/office/word/2010/wordprocessingCanvas" xmlns:cx="http://schemas.microsoft.com/office/drawing/2014/chartex" xmlns:cx1="http://schemas.microsoft.com/office/drawing/2015/9/8/chartex" xmlns:cx2="http://schemas.microsoft.com/office/drawing/2015/10/21/chartex" xmlns:cx3="http://schemas.microsoft.com/office/drawing/2016/5/9/chartex" xmlns:cx4="http://schemas.microsoft.com/office/drawing/2016/5/10/chartex" xmlns:cx5="http://schemas.microsoft.com/office/drawing/2016/5/11/chartex" xmlns:cx6="http://schemas.microsoft.com/office/drawing/2016/5/12/chartex" xmlns:cx7="http://schemas.microsoft.com/office/drawing/2016/5/13/chartex" xmlns:cx8="http://schemas.microsoft.com/office/drawing/2016/5/14/chartex" xmlns:mc="http://schemas.openxmlformats.org/markup-compatibility/2006" xmlns:aink="http://schemas.microsoft.com/office/drawing/2016/ink" xmlns:am3d="http://schemas.microsoft.com/office/drawing/2017/model3d" xmlns:o="urn:schemas-microsoft-com:office:office" xmlns:oel="http://schemas.microsoft.com/office/2019/extlst" xmlns:r="http://schemas.openxmlformats.org/officeDocument/2006/relationships" xmlns:m="http://schemas.openxmlformats.org/officeDocument/2006/math" xmlns:v="urn:schemas-microsoft-com:vml" xmlns:wp14="http://schemas.microsoft.com/office/word/2010/wordprocessingDrawing" xmlns:wp="http://schemas.openxmlformats.org/drawingml/2006/wordprocessingDrawing" xmlns:w10="urn:schemas-microsoft-com:office:word" xmlns:w="http://schemas.openxmlformats.org/wordprocessingml/2006/main" xmlns:w14="http://schemas.microsoft.com/office/word/2010/wordml" xmlns:w15="http://schemas.microsoft.com/office/word/2012/wordml" xmlns:w16cex="http://schemas.microsoft.com/office/word/2018/wordml/cex" xmlns:w16cid="http://schemas.microsoft.com/office/word/2016/wordml/cid" xmlns:w16="http://schemas.microsoft.com/office/word/2018/wordml" xmlns:w16du="http://schemas.microsoft.com/office/word/2023/wordml/word16du" xmlns:w16sdtdh="http://schemas.microsoft.com/office/word/2020/wordml/sdtdatahash" xmlns:w16sdtfl="http://schemas.microsoft.com/office/word/2024/wordml/sdtformatlock" xmlns:w16se="http://schemas.microsoft.com/office/word/2015/wordml/symex" xmlns:wpg="http://schemas.microsoft.com/office/word/2010/wordprocessingGroup" xmlns:wpi="http://schemas.microsoft.com/office/word/2010/wordprocessingInk" xmlns:wne="http://schemas.microsoft.com/office/word/2006/wordml" xmlns:wps="http://schemas.microsoft.com/office/word/2010/wordprocessingShape" mc:Ignorable="w14 w15 w16se w16cid w16 w16cex w16sdtdh w16sdtfl w16du wp14">
   <w:abstractNum w:abstractNumId="0" w15:restartNumberingAfterBreak="0">
     <w:nsid w:val="56205803"/>
     <w:multiLevelType w:val="multilevel"/>
@@ -621,7 +467,7 @@
 </file>
 
 <file path=word/styles.xml><?xml version="1.0" encoding="utf-8"?>
-<w:styles xmlns:mc="http://schemas.openxmlformats.org/markup-compatibility/2006" xmlns:r="http://schemas.openxmlformats.org/officeDocument/2006/relationships" xmlns:w="http://schemas.openxmlformats.org/wordprocessingml/2006/main" xmlns:w14="http://schemas.microsoft.com/office/word/2010/wordml" xmlns:w15="http://schemas.microsoft.com/office/word/2012/wordml" xmlns:w16cex="http://schemas.microsoft.com/office/word/2018/wordml/cex" xmlns:w16cid="http://schemas.microsoft.com/office/word/2016/wordml/cid" xmlns:w16="http://schemas.microsoft.com/office/word/2018/wordml" xmlns:w16du="http://schemas.microsoft.com/office/word/2023/wordml/word16du" xmlns:w16sdtdh="http://schemas.microsoft.com/office/word/2020/wordml/sdtdatahash" xmlns:w16se="http://schemas.microsoft.com/office/word/2015/wordml/symex" mc:Ignorable="w14 w15 w16se w16cid w16 w16cex w16sdtdh w16du">
+<w:styles xmlns:mc="http://schemas.openxmlformats.org/markup-compatibility/2006" xmlns:r="http://schemas.openxmlformats.org/officeDocument/2006/relationships" xmlns:w="http://schemas.openxmlformats.org/wordprocessingml/2006/main" xmlns:w14="http://schemas.microsoft.com/office/word/2010/wordml" xmlns:w15="http://schemas.microsoft.com/office/word/2012/wordml" xmlns:w16cex="http://schemas.microsoft.com/office/word/2018/wordml/cex" xmlns:w16cid="http://schemas.microsoft.com/office/word/2016/wordml/cid" xmlns:w16="http://schemas.microsoft.com/office/word/2018/wordml" xmlns:w16du="http://schemas.microsoft.com/office/word/2023/wordml/word16du" xmlns:w16sdtdh="http://schemas.microsoft.com/office/word/2020/wordml/sdtdatahash" xmlns:w16sdtfl="http://schemas.microsoft.com/office/word/2024/wordml/sdtformatlock" xmlns:w16se="http://schemas.microsoft.com/office/word/2015/wordml/symex" mc:Ignorable="w14 w15 w16se w16cid w16 w16cex w16sdtdh w16sdtfl w16du">
   <w:docDefaults>
     <w:rPrDefault>
       <w:rPr>
@@ -1771,6 +1617,15 @@
     <w:unhideWhenUsed/>
     <w:rsid w:val="00D06915"/>
   </w:style>
+  <w:style w:type="paragraph" w:styleId="Bibliography">
+    <w:name w:val="Bibliography"/>
+    <w:basedOn w:val="Normal"/>
+    <w:next w:val="Normal"/>
+    <w:uiPriority w:val="37"/>
+    <w:semiHidden/>
+    <w:unhideWhenUsed/>
+    <w:rsid w:val="00A41794"/>
+  </w:style>
 </w:styles>
 </file>
 

</xml_diff>